<commit_message>
Publish generated chapter DOCX and PDF files
</commit_message>
<xml_diff>
--- a/PUBLISH/CHAPTERS/01-foundations/01-foundations.docx
+++ b/PUBLISH/CHAPTERS/01-foundations/01-foundations.docx
@@ -1652,7 +1652,7 @@
     </w:p>
     <w:bookmarkEnd w:id="37"/>
     <w:bookmarkEnd w:id="38"/>
-    <w:bookmarkStart w:id="46" w:name="سیر-تکامل-تحول-دیجیتال"/>
+    <w:bookmarkStart w:id="50" w:name="سیر-تکامل-تحول-دیجیتال"/>
     <w:p>
       <w:pPr>
         <w:pStyle w:val="Heading1"/>
@@ -1667,39 +1667,68 @@
         <w:t xml:space="preserve">1.3 سیر تکامل تحول دیجیتال</w:t>
       </w:r>
     </w:p>
-    <w:tbl>
-      <w:tblPr>
-        <w:tblStyle w:val="FigureTable"/>
-        <w:tblW w:type="auto" w:w="0"/>
-        <w:tblLook w:firstRow="0" w:lastRow="0" w:firstColumn="0" w:lastColumn="0"/>
-        <w:jc w:val="center"/>
-      </w:tblPr>
-      <w:tblGrid>
-        <w:gridCol w:w="7920"/>
-      </w:tblGrid>
-      <w:tr>
-        <w:tc>
-          <w:tcPr>
-            <w:textDirection w:val="tbRl"/>
-          </w:tcPr>
-          <w:p>
-            <w:pPr>
-              <w:pStyle w:val="Compact"/>
-              <w:bidi/>
-              <w:jc w:val="right"/>
-            </w:pPr>
-            <w:r>
-              <w:rPr>
-                <w:rFonts w:ascii="Noto Sans" w:hAnsi="Noto Sans" w:cs="Noto Naskh Arabic" w:eastAsia="Noto Sans"/>
-                <w:sz w:val="24"/>
-                <w:rtl/>
-              </w:rPr>
-              <w:t xml:space="preserve">سیر تحول دیجیتال</w:t>
-            </w:r>
-          </w:p>
-        </w:tc>
-      </w:tr>
-    </w:tbl>
+    <w:p>
+      <w:pPr>
+        <w:pStyle w:val="CaptionedFigure"/>
+        <w:bidi/>
+        <w:jc w:val="right"/>
+      </w:pPr>
+      <w:r>
+        <w:rPr>
+          <w:rFonts w:ascii="Noto Sans" w:hAnsi="Noto Sans" w:cs="Noto Naskh Arabic" w:eastAsia="Noto Sans"/>
+          <w:sz w:val="24"/>
+        </w:rPr>
+        <w:drawing>
+          <wp:inline>
+            <wp:extent cx="5969000" cy="2138891"/>
+            <wp:effectExtent b="0" l="0" r="0" t="0"/>
+            <wp:docPr descr="سیر تحول دیجیتال" title="" id="40" name="Picture"/>
+            <a:graphic>
+              <a:graphicData uri="http://schemas.openxmlformats.org/drawingml/2006/picture">
+                <pic:pic>
+                  <pic:nvPicPr>
+                    <pic:cNvPr descr="figures/digital-evolution.svg" id="41" name="Picture"/>
+                    <pic:cNvPicPr>
+                      <a:picLocks noChangeArrowheads="1" noChangeAspect="1"/>
+                    </pic:cNvPicPr>
+                  </pic:nvPicPr>
+                  <pic:blipFill>
+                    <a:blip r:embed="rId42">
+                      <a:extLst>
+                        <a:ext uri="{28A0092B-C50C-407E-A947-70E740481C1C}">
+                          <a14:useLocalDpi xmlns:a14="http://schemas.microsoft.com/office/drawing/2010/main" val="0"/>
+                        </a:ext>
+                        <a:ext uri="{96DAC541-7B7A-43D3-8B79-37D633B846F1}">
+                          <asvg:svgBlip xmlns:asvg="http://schemas.microsoft.com/office/drawing/2016/SVG/main" r:embed="rId39"/>
+                        </a:ext>
+                      </a:extLst>
+                    </a:blip>
+                    <a:stretch>
+                      <a:fillRect/>
+                    </a:stretch>
+                  </pic:blipFill>
+                  <pic:spPr bwMode="auto">
+                    <a:xfrm>
+                      <a:off x="0" y="0"/>
+                      <a:ext cx="5969000" cy="2138891"/>
+                    </a:xfrm>
+                    <a:prstGeom prst="rect">
+                      <a:avLst/>
+                    </a:prstGeom>
+                    <a:noFill/>
+                    <a:ln w="9525">
+                      <a:noFill/>
+                      <a:headEnd/>
+                      <a:tailEnd/>
+                    </a:ln>
+                  </pic:spPr>
+                </pic:pic>
+              </a:graphicData>
+            </a:graphic>
+          </wp:inline>
+        </w:drawing>
+      </w:r>
+    </w:p>
     <w:p>
       <w:pPr>
         <w:pStyle w:val="ImageCaption"/>
@@ -1761,7 +1790,7 @@
         <w:t xml:space="preserve">تحول دیجیتال را بهتر است نه به‌عنوان یک رویداد، بلکه به‌عنوان یک مسیر چندمرحله‌ای در نظر بگیریم که در آن نقش فناوری، داده و نرم‌افزار در سازمان به‌تدریج تغییر می‌کند. نقطه شروع معمولاً افزایش کارایی عملیاتی است؛ اما در مراحل پیشرفته‌تر، تغییر به فرایند، تجربه مشتری، قابلیت سازمانی، مدل کسب‌وکار و سازوکار تصمیم‌گیری می‌رسد. کتاب‌های مرجع ۲۰۲۵ نیز همین پیوند را از فناوری و داده تا استراتژی، مدل کسب‌وکار، Digital Core و رهبری دنبال می‌کنند. [1][2]</w:t>
       </w:r>
     </w:p>
-    <w:bookmarkStart w:id="39" w:name="از-رایانش-سازمانی-تا-دیجیتالیشدن"/>
+    <w:bookmarkStart w:id="43" w:name="از-رایانش-سازمانی-تا-دیجیتالیشدن"/>
     <w:p>
       <w:pPr>
         <w:pStyle w:val="Heading2"/>
@@ -1804,8 +1833,8 @@
         <w:t xml:space="preserve">با گسترش شبکه‌های ارتباطی، اینترنت و سامانه‌های سازمانی، فناوری از یک ابزار پشتیبان داخلی به زیرساختی برای ارتباط، تعامل و اجرای فرایند تبدیل شد. تجارت الکترونیکی، ERP، CRM، پورتال‌های سازمانی و بعدتر رایانش ابری مرز میان «واحد فناوری» و «عملیات سازمان» را کاهش دادند. در اینجا، دیجیتال‌کردن دیگر فقط به ذخیره اطلاعات محدود نبود؛ بخشی از تجربه مشتری و جریان ارزش نیز دیجیتال شد.</w:t>
       </w:r>
     </w:p>
-    <w:bookmarkEnd w:id="39"/>
-    <w:bookmarkStart w:id="40" w:name="از-digitization-به-digitalization"/>
+    <w:bookmarkEnd w:id="43"/>
+    <w:bookmarkStart w:id="44" w:name="از-digitization-به-digitalization"/>
     <w:p>
       <w:pPr>
         <w:pStyle w:val="Heading2"/>
@@ -1912,8 +1941,8 @@
         <w:t xml:space="preserve">مرور نظام‌مند ۲۰۲۵ درباره عوامل تحول دیجیتال نیز نشان می‌دهد ادبیات علمی تحول را به مجموعه‌ای از عوامل فناورانه، سازمانی، محیطی و فردی مرتبط می‌داند و بنابراین نمی‌توان مرز تحول را فقط با وجود یک فناوری تعیین کرد. [3]</w:t>
       </w:r>
     </w:p>
-    <w:bookmarkEnd w:id="40"/>
-    <w:bookmarkStart w:id="41" w:name="ظهور-digital-transformation"/>
+    <w:bookmarkEnd w:id="44"/>
+    <w:bookmarkStart w:id="45" w:name="ظهور-digital-transformation"/>
     <w:p>
       <w:pPr>
         <w:pStyle w:val="Heading2"/>
@@ -1982,8 +2011,8 @@
         <w:t xml:space="preserve">کتاب McIvor در ۲۰۲۵ این پیوند را به‌صورت منسجم میان فناوری‌های دیجیتال، فرایندها، محصولات، مدل‌های کسب‌وکار، استراتژی و قابلیت‌های سازمانی دنبال می‌کند. [1] این نوع نگاه برای فهم فصل‌های بعدی کتاب مهم است، زیرا استراتژی و معماری بدون درک تغییر قابلیت‌ها قابل طراحی دقیق نیستند.</w:t>
       </w:r>
     </w:p>
-    <w:bookmarkEnd w:id="41"/>
-    <w:bookmarkStart w:id="42" w:name="داده-پلتفرم-و-اقتصاد-دیجیتال"/>
+    <w:bookmarkEnd w:id="45"/>
+    <w:bookmarkStart w:id="46" w:name="داده-پلتفرم-و-اقتصاد-دیجیتال"/>
     <w:p>
       <w:pPr>
         <w:pStyle w:val="Heading2"/>
@@ -2026,8 +2055,8 @@
         <w:t xml:space="preserve">هم‌زمان، پلتفرم‌های دیجیتال امکان دادند خلق ارزش به شبکه‌ای از کاربران، شرکا، توسعه‌دهندگان و ارائه‌دهندگان خدمت متصل شود. در این الگو، فناوری صرفاً ابزار اجرای عملیات داخلی نیست؛ بخشی از زیرساخت اکوسیستم ارزش‌آفرینی است. Lee در کتاب ۲۰۲۵ خود نیز تحول را از مبانی دیجیتال به پلتفرم‌ها، فناوری‌های دیجیتال و سپس AI و کاربردهای صنعتی و اجتماعی دنبال می‌کند. [2]</w:t>
       </w:r>
     </w:p>
-    <w:bookmarkEnd w:id="42"/>
-    <w:bookmarkStart w:id="43" w:name="ورود-ai-به-تحول-سازمانی"/>
+    <w:bookmarkEnd w:id="46"/>
+    <w:bookmarkStart w:id="47" w:name="ورود-ai-به-تحول-سازمانی"/>
     <w:p>
       <w:pPr>
         <w:pStyle w:val="Heading2"/>
@@ -2152,8 +2181,8 @@
         <w:t xml:space="preserve">کتاب Tao و همکاران در ۲۰۲۵ نیز دقیقاً فاصله میان «نوآوری AI» و «پیاده‌سازی در صنعت» را برجسته می‌کند و نمونه‌هایی از معماری‌های cloud-edge، سامانه‌های cyber-physical، لجستیک، زنجیره تأمین و Digital Twin را بررسی می‌کند. [4]</w:t>
       </w:r>
     </w:p>
-    <w:bookmarkEnd w:id="43"/>
-    <w:bookmarkStart w:id="45" w:name="X6b74a7c704558de4fca2f84e31483979c4db466"/>
+    <w:bookmarkEnd w:id="47"/>
+    <w:bookmarkStart w:id="49" w:name="X6b74a7c704558de4fca2f84e31483979c4db466"/>
     <w:p>
       <w:pPr>
         <w:pStyle w:val="Heading2"/>
@@ -2694,7 +2723,7 @@
         <w:t xml:space="preserve">سطح آخر هنوز یک مفهوم در حال شکل‌گیری است و نباید آن را به‌عنوان یک استاندارد رسمی یا یک مدل تاریخی قطعی تلقی کرد.</w:t>
       </w:r>
     </w:p>
-    <w:bookmarkStart w:id="44" w:name="جمعبندی"/>
+    <w:bookmarkStart w:id="48" w:name="جمعبندی"/>
     <w:p>
       <w:pPr>
         <w:pStyle w:val="Heading3"/>
@@ -2854,10 +2883,10 @@
         </w:pict>
       </w:r>
     </w:p>
-    <w:bookmarkEnd w:id="44"/>
-    <w:bookmarkEnd w:id="45"/>
-    <w:bookmarkEnd w:id="46"/>
-    <w:bookmarkStart w:id="58" w:name="مفاهیم-بنیادی-و-مرزبندی-مفهومی"/>
+    <w:bookmarkEnd w:id="48"/>
+    <w:bookmarkEnd w:id="49"/>
+    <w:bookmarkEnd w:id="50"/>
+    <w:bookmarkStart w:id="62" w:name="مفاهیم-بنیادی-و-مرزبندی-مفهومی"/>
     <w:p>
       <w:pPr>
         <w:pStyle w:val="Heading1"/>
@@ -2886,7 +2915,7 @@
         <w:t xml:space="preserve">یکی از مهم‌ترین مشکلات تحول دیجیتال، آشفتگی مفهومی است. اگر Digitization، Digitalization و Digital Transformation به‌جای یکدیگر به کار روند، اندازه‌گیری پیشرفت، انتخاب فناوری و ارزیابی موفقیت نیز مبهم می‌شود. در این فصل از یک تمایز آموزشی استفاده می‌کنیم که در ادامه کتاب ثابت خواهد ماند؛ این تمایز برای همه سازمان‌ها یک قانون سخت تاریخی نیست، اما برای تحلیل و آموزش بسیار مفید است.</w:t>
       </w:r>
     </w:p>
-    <w:bookmarkStart w:id="47" w:name="digitization-دیجیتالیسازی"/>
+    <w:bookmarkStart w:id="51" w:name="digitization-دیجیتالیسازی"/>
     <w:p>
       <w:pPr>
         <w:pStyle w:val="Heading2"/>
@@ -3018,8 +3047,8 @@
         <w:t xml:space="preserve">در این سطح، ممکن است هیچ تغییری در فرایند، ساختار سازمان یا منطق تصمیم‌گیری رخ ندهد. بنابراین دیجیتالی‌شدن اطلاعات می‌تواند پیش‌نیاز تحول باشد، اما به‌تنهایی تحول سازمانی محسوب نمی‌شود.</w:t>
       </w:r>
     </w:p>
-    <w:bookmarkEnd w:id="47"/>
-    <w:bookmarkStart w:id="48" w:name="Xfbc5750aed69a5c08387eefb6433df79fcb98dc"/>
+    <w:bookmarkEnd w:id="51"/>
+    <w:bookmarkStart w:id="52" w:name="Xfbc5750aed69a5c08387eefb6433df79fcb98dc"/>
     <w:p>
       <w:pPr>
         <w:pStyle w:val="Heading2"/>
@@ -3094,8 +3123,8 @@
         <w:t xml:space="preserve">اما حتی Digitalization نیز الزاماً به معنی تغییر مدل کسب‌وکار نیست. ممکن است یک سازمان فرایند موجود را بسیار کارآمدتر کند بدون اینکه محصول، بازار هدف یا منطق خلق ارزش خود را تغییر دهد.</w:t>
       </w:r>
     </w:p>
-    <w:bookmarkEnd w:id="48"/>
-    <w:bookmarkStart w:id="49" w:name="digital-transformation-تحول-دیجیتال"/>
+    <w:bookmarkEnd w:id="52"/>
+    <w:bookmarkStart w:id="53" w:name="digital-transformation-تحول-دیجیتال"/>
     <w:p>
       <w:pPr>
         <w:pStyle w:val="Heading2"/>
@@ -3170,8 +3199,8 @@
         <w:t xml:space="preserve">کتاب McIvor در ۲۰۲۵ نیز تحول دیجیتال را در پیوند میان فناوری، فرایند، محصول، مدل کسب‌وکار، استراتژی و قابلیت‌های سازمانی بررسی می‌کند. [1] استاندارد IEEE 2023-2025 نیز بر ارتباط سه عنصر people، process و digital technologies در برنامه تحول تأکید دارد. [5]</w:t>
       </w:r>
     </w:p>
-    <w:bookmarkEnd w:id="49"/>
-    <w:bookmarkStart w:id="50" w:name="تحول-دیجیتال-در-برابر-it-modernization"/>
+    <w:bookmarkEnd w:id="53"/>
+    <w:bookmarkStart w:id="54" w:name="تحول-دیجیتال-در-برابر-it-modernization"/>
     <w:p>
       <w:pPr>
         <w:pStyle w:val="Heading2"/>
@@ -3232,8 +3261,8 @@
         <w:t xml:space="preserve">یک سازمان ممکن است تمام سامانه‌های خود را به cloud منتقل کند و همچنان همان محصولات، همان فرایندهای ناکارآمد و همان منطق تصمیم‌گیری را داشته باشد. در این حالت، نوسازی فناوری اتفاق افتاده است، اما شواهد تحول سازمانی هنوز کافی نیست.</w:t>
       </w:r>
     </w:p>
-    <w:bookmarkEnd w:id="50"/>
-    <w:bookmarkStart w:id="51" w:name="X134db0dd405d13007c81059954ad0720a99a0da"/>
+    <w:bookmarkEnd w:id="54"/>
+    <w:bookmarkStart w:id="55" w:name="X134db0dd405d13007c81059954ad0720a99a0da"/>
     <w:p>
       <w:pPr>
         <w:pStyle w:val="Heading2"/>
@@ -3324,8 +3353,8 @@
         <w:t xml:space="preserve">همچنین این اصطلاح به معنی «خودمختاری کامل سازمان» نیست. در بسیاری از کاربردها، معماری مناسب ترکیبی از انسان و ماشین است و تصمیم‌های حساس به نظارت انسانی، کنترل‌های فنی و سازوکارهای حکمرانی نیاز دارند.</w:t>
       </w:r>
     </w:p>
-    <w:bookmarkEnd w:id="51"/>
-    <w:bookmarkStart w:id="52" w:name="ai-enabled-در-برابر-ai-native"/>
+    <w:bookmarkEnd w:id="55"/>
+    <w:bookmarkStart w:id="56" w:name="ai-enabled-در-برابر-ai-native"/>
     <w:p>
       <w:pPr>
         <w:pStyle w:val="Heading2"/>
@@ -3420,8 +3449,8 @@
         <w:t xml:space="preserve">معمولاً برای سازمانی به کار می‌رود که AI در طراحی فرایند، ساختار، محصولات، تصمیم‌گیری یا منطق عملیاتی آن از ابتدا نقش بنیادی دارد. این مفهوم هنوز در حال تثبیت است و تعریف واحد و استانداردشده‌ای برای همه ادبیات و صنایع ندارد. بنابراین در این کتاب، AI-Native یک مفهوم پژوهشی در حال شکل‌گیری تلقی می‌شود، نه یک طبقه‌بندی رسمی قطعی.</w:t>
       </w:r>
     </w:p>
-    <w:bookmarkEnd w:id="52"/>
-    <w:bookmarkStart w:id="53" w:name="پروژه-فناوری-در-برابر-برنامه-تحول"/>
+    <w:bookmarkEnd w:id="56"/>
+    <w:bookmarkStart w:id="57" w:name="پروژه-فناوری-در-برابر-برنامه-تحول"/>
     <w:p>
       <w:pPr>
         <w:pStyle w:val="Heading2"/>
@@ -3513,8 +3542,8 @@
         <w:t xml:space="preserve">آیا این پروژه بخشی از یک تغییر بزرگ‌تر است که قابلیت و ارزش سازمان را بهبود می‌دهد؟</w:t>
       </w:r>
     </w:p>
-    <w:bookmarkEnd w:id="53"/>
-    <w:bookmarkStart w:id="54" w:name="Xa8fcd92035a455f5e329ad1bb67337030b49288"/>
+    <w:bookmarkEnd w:id="57"/>
+    <w:bookmarkStart w:id="58" w:name="Xa8fcd92035a455f5e329ad1bb67337030b49288"/>
     <w:p>
       <w:pPr>
         <w:pStyle w:val="Heading2"/>
@@ -3669,8 +3698,8 @@
         <w:t xml:space="preserve">از همین‌جا می‌توان فهمید چرا یک سازمان ممکن است فناوری پیشرفته داشته باشد اما همچنان تحول‌یافته نباشد.</w:t>
       </w:r>
     </w:p>
-    <w:bookmarkEnd w:id="54"/>
-    <w:bookmarkStart w:id="57" w:name="هفت-سؤال-برای-تشخیص-یک-ابتکار-تحول"/>
+    <w:bookmarkEnd w:id="58"/>
+    <w:bookmarkStart w:id="61" w:name="هفت-سؤال-برای-تشخیص-یک-ابتکار-تحول"/>
     <w:p>
       <w:pPr>
         <w:pStyle w:val="Heading2"/>
@@ -3846,7 +3875,7 @@
         <w:t xml:space="preserve">این هفت سؤال به‌صورت عمدی ساده‌اند. هدف آن‌ها تولید یک ابزار تشخیصی اولیه است؛ در فصل سوم این پرسش‌ها به ابزارهای استراتژی، بلوغ و Capability Map متصل خواهند شد.</w:t>
       </w:r>
     </w:p>
-    <w:bookmarkStart w:id="55" w:name="مثال-جمعبندی"/>
+    <w:bookmarkStart w:id="59" w:name="مثال-جمعبندی"/>
     <w:p>
       <w:pPr>
         <w:pStyle w:val="Heading3"/>
@@ -4067,8 +4096,8 @@
         <w:t xml:space="preserve">صحبت کرد؛ البته با حفظ کنترل‌ها و نظارت لازم.</w:t>
       </w:r>
     </w:p>
-    <w:bookmarkEnd w:id="55"/>
-    <w:bookmarkStart w:id="56" w:name="نکته-آموزشی"/>
+    <w:bookmarkEnd w:id="59"/>
+    <w:bookmarkStart w:id="60" w:name="نکته-آموزشی"/>
     <w:p>
       <w:pPr>
         <w:pStyle w:val="Heading3"/>
@@ -4114,10 +4143,10 @@
         </w:pict>
       </w:r>
     </w:p>
-    <w:bookmarkEnd w:id="56"/>
-    <w:bookmarkEnd w:id="57"/>
-    <w:bookmarkEnd w:id="58"/>
-    <w:bookmarkStart w:id="66" w:name="تحول-دیجیتال-بهعنوان-یک-سیستم-اجتماعیفنی"/>
+    <w:bookmarkEnd w:id="60"/>
+    <w:bookmarkEnd w:id="61"/>
+    <w:bookmarkEnd w:id="62"/>
+    <w:bookmarkStart w:id="74" w:name="تحول-دیجیتال-بهعنوان-یک-سیستم-اجتماعیفنی"/>
     <w:p>
       <w:pPr>
         <w:pStyle w:val="Heading1"/>
@@ -4132,39 +4161,68 @@
         <w:t xml:space="preserve">1.5 تحول دیجیتال به‌عنوان یک سیستم اجتماعی–فنی</w:t>
       </w:r>
     </w:p>
-    <w:tbl>
-      <w:tblPr>
-        <w:tblStyle w:val="FigureTable"/>
-        <w:tblW w:type="auto" w:w="0"/>
-        <w:tblLook w:firstRow="0" w:lastRow="0" w:firstColumn="0" w:lastColumn="0"/>
-        <w:jc w:val="center"/>
-      </w:tblPr>
-      <w:tblGrid>
-        <w:gridCol w:w="7920"/>
-      </w:tblGrid>
-      <w:tr>
-        <w:tc>
-          <w:tcPr>
-            <w:textDirection w:val="tbRl"/>
-          </w:tcPr>
-          <w:p>
-            <w:pPr>
-              <w:pStyle w:val="Compact"/>
-              <w:bidi/>
-              <w:jc w:val="right"/>
-            </w:pPr>
-            <w:r>
-              <w:rPr>
-                <w:rFonts w:ascii="Noto Sans" w:hAnsi="Noto Sans" w:cs="Noto Naskh Arabic" w:eastAsia="Noto Sans"/>
-                <w:sz w:val="24"/>
-                <w:rtl/>
-              </w:rPr>
-              <w:t xml:space="preserve">چارچوب شش‌ستونه تحول دیجیتال هوشمند</w:t>
-            </w:r>
-          </w:p>
-        </w:tc>
-      </w:tr>
-    </w:tbl>
+    <w:p>
+      <w:pPr>
+        <w:pStyle w:val="CaptionedFigure"/>
+        <w:bidi/>
+        <w:jc w:val="right"/>
+      </w:pPr>
+      <w:r>
+        <w:rPr>
+          <w:rFonts w:ascii="Noto Sans" w:hAnsi="Noto Sans" w:cs="Noto Naskh Arabic" w:eastAsia="Noto Sans"/>
+          <w:sz w:val="24"/>
+        </w:rPr>
+        <w:drawing>
+          <wp:inline>
+            <wp:extent cx="5969000" cy="3233208"/>
+            <wp:effectExtent b="0" l="0" r="0" t="0"/>
+            <wp:docPr descr="چارچوب شش‌ستونه تحول دیجیتال هوشمند" title="" id="64" name="Picture"/>
+            <a:graphic>
+              <a:graphicData uri="http://schemas.openxmlformats.org/drawingml/2006/picture">
+                <pic:pic>
+                  <pic:nvPicPr>
+                    <pic:cNvPr descr="figures/six-pillars.svg" id="65" name="Picture"/>
+                    <pic:cNvPicPr>
+                      <a:picLocks noChangeArrowheads="1" noChangeAspect="1"/>
+                    </pic:cNvPicPr>
+                  </pic:nvPicPr>
+                  <pic:blipFill>
+                    <a:blip r:embed="rId66">
+                      <a:extLst>
+                        <a:ext uri="{28A0092B-C50C-407E-A947-70E740481C1C}">
+                          <a14:useLocalDpi xmlns:a14="http://schemas.microsoft.com/office/drawing/2010/main" val="0"/>
+                        </a:ext>
+                        <a:ext uri="{96DAC541-7B7A-43D3-8B79-37D633B846F1}">
+                          <asvg:svgBlip xmlns:asvg="http://schemas.microsoft.com/office/drawing/2016/SVG/main" r:embed="rId63"/>
+                        </a:ext>
+                      </a:extLst>
+                    </a:blip>
+                    <a:stretch>
+                      <a:fillRect/>
+                    </a:stretch>
+                  </pic:blipFill>
+                  <pic:spPr bwMode="auto">
+                    <a:xfrm>
+                      <a:off x="0" y="0"/>
+                      <a:ext cx="5969000" cy="3233208"/>
+                    </a:xfrm>
+                    <a:prstGeom prst="rect">
+                      <a:avLst/>
+                    </a:prstGeom>
+                    <a:noFill/>
+                    <a:ln w="9525">
+                      <a:noFill/>
+                      <a:headEnd/>
+                      <a:tailEnd/>
+                    </a:ln>
+                  </pic:spPr>
+                </pic:pic>
+              </a:graphicData>
+            </a:graphic>
+          </wp:inline>
+        </w:drawing>
+      </w:r>
+    </w:p>
     <w:p>
       <w:pPr>
         <w:pStyle w:val="ImageCaption"/>
@@ -4226,7 +4284,7 @@
         <w:t xml:space="preserve">یکی از مهم‌ترین خطاهای تحلیلی در تحول دیجیتال، تقلیل آن به فناوری است. سازمان یک سیستم اجتماعی–فنی است؛ یعنی عملکرد آن حاصل تعامل فناوری با انسان، فرایند، ساختار، فرهنگ، قوانین و محیط است.</w:t>
       </w:r>
     </w:p>
-    <w:bookmarkStart w:id="59" w:name="چرا-فناوری-بهتنهایی-کافی-نیست"/>
+    <w:bookmarkStart w:id="67" w:name="چرا-فناوری-بهتنهایی-کافی-نیست"/>
     <w:p>
       <w:pPr>
         <w:pStyle w:val="Heading2"/>
@@ -4383,8 +4441,8 @@
         <w:t xml:space="preserve">نمی‌توان گفت سازمان صرفاً به دلیل نصب فناوری متحول شده است.</w:t>
       </w:r>
     </w:p>
-    <w:bookmarkEnd w:id="59"/>
-    <w:bookmarkStart w:id="60" w:name="پنج-جزء-اجتماعیفنی"/>
+    <w:bookmarkEnd w:id="67"/>
+    <w:bookmarkStart w:id="68" w:name="پنج-جزء-اجتماعیفنی"/>
     <w:p>
       <w:pPr>
         <w:pStyle w:val="Heading2"/>
@@ -4587,8 +4645,8 @@
         <w:t xml:space="preserve">تحول پایدار زمانی رخ می‌دهد که این اجزا به‌صورت هماهنگ تغییر کنند.</w:t>
       </w:r>
     </w:p>
-    <w:bookmarkEnd w:id="60"/>
-    <w:bookmarkStart w:id="61" w:name="چارچوب-ششستونه-کتاب"/>
+    <w:bookmarkEnd w:id="68"/>
+    <w:bookmarkStart w:id="69" w:name="چارچوب-ششستونه-کتاب"/>
     <w:p>
       <w:pPr>
         <w:pStyle w:val="Heading2"/>
@@ -4853,8 +4911,8 @@
         <w:t xml:space="preserve">این چارچوب یک مدل آموزشی است و ادعای استانداردبودن آن در ادبیات ندارد. مزیت آن ایجاد زبان مشترک برای فصل‌های بعدی است.</w:t>
       </w:r>
     </w:p>
-    <w:bookmarkEnd w:id="61"/>
-    <w:bookmarkStart w:id="62" w:name="شواهد-پژوهشی-جدید"/>
+    <w:bookmarkEnd w:id="69"/>
+    <w:bookmarkStart w:id="70" w:name="شواهد-پژوهشی-جدید"/>
     <w:p>
       <w:pPr>
         <w:pStyle w:val="Heading2"/>
@@ -4931,8 +4989,8 @@
         <w:t xml:space="preserve">در ۲۰۲۵ نیز هم‌راستا است؛ این مطالعه نقش فناوری‌های شناختی مانند AI و IoT را در کنار عامل انسانی و قابلیت تحول بررسی می‌کند. [6]</w:t>
       </w:r>
     </w:p>
-    <w:bookmarkEnd w:id="62"/>
-    <w:bookmarkStart w:id="63" w:name="نمونه-آموزشی-بیمارستان"/>
+    <w:bookmarkEnd w:id="70"/>
+    <w:bookmarkStart w:id="71" w:name="نمونه-آموزشی-بیمارستان"/>
     <w:p>
       <w:pPr>
         <w:pStyle w:val="Heading2"/>
@@ -5089,8 +5147,8 @@
         <w:t xml:space="preserve">در نتیجه، «مدل AI» فقط یک جزء از یک سیستم اجتماعی–فنی بزرگ‌تر است.</w:t>
       </w:r>
     </w:p>
-    <w:bookmarkEnd w:id="63"/>
-    <w:bookmarkStart w:id="65" w:name="پیام-برای-مدیر-تحول"/>
+    <w:bookmarkEnd w:id="71"/>
+    <w:bookmarkStart w:id="73" w:name="پیام-برای-مدیر-تحول"/>
     <w:p>
       <w:pPr>
         <w:pStyle w:val="Heading2"/>
@@ -5119,7 +5177,7 @@
         <w:t xml:space="preserve">مدیر تحول نباید فقط مدیر فناوری باشد. وظیفه او ایجاد هماهنگی میان فناوری و سازمان است. این هماهنگی شامل تعریف مسئله، ایجاد قابلیت، بازطراحی فرایند، آموزش افراد، مدیریت تغییر و ایجاد سازوکار کنترل است.</w:t>
       </w:r>
     </w:p>
-    <w:bookmarkStart w:id="64" w:name="اصل-فصل"/>
+    <w:bookmarkStart w:id="72" w:name="اصل-فصل"/>
     <w:p>
       <w:pPr>
         <w:pStyle w:val="Heading3"/>
@@ -5166,10 +5224,10 @@
         </w:pict>
       </w:r>
     </w:p>
-    <w:bookmarkEnd w:id="64"/>
-    <w:bookmarkEnd w:id="65"/>
-    <w:bookmarkEnd w:id="66"/>
-    <w:bookmarkStart w:id="75" w:name="از-سازمان-دیجیتال-تا-سازمان-ai-native"/>
+    <w:bookmarkEnd w:id="72"/>
+    <w:bookmarkEnd w:id="73"/>
+    <w:bookmarkEnd w:id="74"/>
+    <w:bookmarkStart w:id="87" w:name="از-سازمان-دیجیتال-تا-سازمان-ai-native"/>
     <w:p>
       <w:pPr>
         <w:pStyle w:val="Heading1"/>
@@ -5184,39 +5242,68 @@
         <w:t xml:space="preserve">1.6 از سازمان دیجیتال تا سازمان AI-Native</w:t>
       </w:r>
     </w:p>
-    <w:tbl>
-      <w:tblPr>
-        <w:tblStyle w:val="FigureTable"/>
-        <w:tblW w:type="auto" w:w="0"/>
-        <w:tblLook w:firstRow="0" w:lastRow="0" w:firstColumn="0" w:lastColumn="0"/>
-        <w:jc w:val="center"/>
-      </w:tblPr>
-      <w:tblGrid>
-        <w:gridCol w:w="7920"/>
-      </w:tblGrid>
-      <w:tr>
-        <w:tc>
-          <w:tcPr>
-            <w:textDirection w:val="tbRl"/>
-          </w:tcPr>
-          <w:p>
-            <w:pPr>
-              <w:pStyle w:val="Compact"/>
-              <w:bidi/>
-              <w:jc w:val="right"/>
-            </w:pPr>
-            <w:r>
-              <w:rPr>
-                <w:rFonts w:ascii="Noto Sans" w:hAnsi="Noto Sans" w:cs="Noto Naskh Arabic" w:eastAsia="Noto Sans"/>
-                <w:sz w:val="24"/>
-                <w:rtl/>
-              </w:rPr>
-              <w:t xml:space="preserve">سازمان AI-Enabled در برابر AI-Native</w:t>
-            </w:r>
-          </w:p>
-        </w:tc>
-      </w:tr>
-    </w:tbl>
+    <w:p>
+      <w:pPr>
+        <w:pStyle w:val="CaptionedFigure"/>
+        <w:bidi/>
+        <w:jc w:val="right"/>
+      </w:pPr>
+      <w:r>
+        <w:rPr>
+          <w:rFonts w:ascii="Noto Sans" w:hAnsi="Noto Sans" w:cs="Noto Naskh Arabic" w:eastAsia="Noto Sans"/>
+          <w:sz w:val="24"/>
+        </w:rPr>
+        <w:drawing>
+          <wp:inline>
+            <wp:extent cx="5969000" cy="2586566"/>
+            <wp:effectExtent b="0" l="0" r="0" t="0"/>
+            <wp:docPr descr="سازمان AI-Enabled در برابر AI-Native" title="" id="76" name="Picture"/>
+            <a:graphic>
+              <a:graphicData uri="http://schemas.openxmlformats.org/drawingml/2006/picture">
+                <pic:pic>
+                  <pic:nvPicPr>
+                    <pic:cNvPr descr="figures/ai-enabled-vs-ai-native.svg" id="77" name="Picture"/>
+                    <pic:cNvPicPr>
+                      <a:picLocks noChangeArrowheads="1" noChangeAspect="1"/>
+                    </pic:cNvPicPr>
+                  </pic:nvPicPr>
+                  <pic:blipFill>
+                    <a:blip r:embed="rId78">
+                      <a:extLst>
+                        <a:ext uri="{28A0092B-C50C-407E-A947-70E740481C1C}">
+                          <a14:useLocalDpi xmlns:a14="http://schemas.microsoft.com/office/drawing/2010/main" val="0"/>
+                        </a:ext>
+                        <a:ext uri="{96DAC541-7B7A-43D3-8B79-37D633B846F1}">
+                          <asvg:svgBlip xmlns:asvg="http://schemas.microsoft.com/office/drawing/2016/SVG/main" r:embed="rId75"/>
+                        </a:ext>
+                      </a:extLst>
+                    </a:blip>
+                    <a:stretch>
+                      <a:fillRect/>
+                    </a:stretch>
+                  </pic:blipFill>
+                  <pic:spPr bwMode="auto">
+                    <a:xfrm>
+                      <a:off x="0" y="0"/>
+                      <a:ext cx="5969000" cy="2586566"/>
+                    </a:xfrm>
+                    <a:prstGeom prst="rect">
+                      <a:avLst/>
+                    </a:prstGeom>
+                    <a:noFill/>
+                    <a:ln w="9525">
+                      <a:noFill/>
+                      <a:headEnd/>
+                      <a:tailEnd/>
+                    </a:ln>
+                  </pic:spPr>
+                </pic:pic>
+              </a:graphicData>
+            </a:graphic>
+          </wp:inline>
+        </w:drawing>
+      </w:r>
+    </w:p>
     <w:p>
       <w:pPr>
         <w:pStyle w:val="ImageCaption"/>
@@ -5346,7 +5433,7 @@
         <w:t xml:space="preserve">را شکل می‌دهد.</w:t>
       </w:r>
     </w:p>
-    <w:bookmarkStart w:id="67" w:name="ai-enabled-یعنی-چه"/>
+    <w:bookmarkStart w:id="79" w:name="ai-enabled-یعنی-چه"/>
     <w:p>
       <w:pPr>
         <w:pStyle w:val="Heading2"/>
@@ -5389,8 +5476,8 @@
         <w:t xml:space="preserve">این رویکرد الزاماً سطح پایینی از بلوغ نیست. بسیاری از سازمان‌ها منطقی است که تحول را از همین نقطه آغاز کنند. ارزش این مرحله زمانی ایجاد می‌شود که استفاده از AI به مسئله واقعی، فرایند مشخص و معیار عملکرد متصل باشد؛ نه اینکه صرفاً به دلیل جدیدبودن فناوری یک ابزار خریداری شود.</w:t>
       </w:r>
     </w:p>
-    <w:bookmarkEnd w:id="67"/>
-    <w:bookmarkStart w:id="68" w:name="ai-native-یک-مفهوم-نوظهور-است"/>
+    <w:bookmarkEnd w:id="79"/>
+    <w:bookmarkStart w:id="80" w:name="ai-native-یک-مفهوم-نوظهور-است"/>
     <w:p>
       <w:pPr>
         <w:pStyle w:val="Heading2"/>
@@ -5499,8 +5586,8 @@
         <w:t xml:space="preserve">می‌دانیم، نه برچسبی که بتوان با یک آزمون ساده و قطعی به همه سازمان‌ها نسبت داد.</w:t>
       </w:r>
     </w:p>
-    <w:bookmarkEnd w:id="68"/>
-    <w:bookmarkStart w:id="69" w:name="تعریف-عملیاتی-کتاب"/>
+    <w:bookmarkEnd w:id="80"/>
+    <w:bookmarkStart w:id="81" w:name="تعریف-عملیاتی-کتاب"/>
     <w:p>
       <w:pPr>
         <w:pStyle w:val="Heading2"/>
@@ -5591,8 +5678,8 @@
         <w:t xml:space="preserve">نخست، چند ابزار AI به‌تنهایی سازمان را AI-Native نمی‌کنند. دوم، AI-Native بودن یک ویژگی صفر و یکی نیست و می‌تواند در بخش‌هایی از سازمان بیشتر از بخش‌های دیگر دیده شود. سوم، AI-Native بودن الزاماً به معنای خودمختاری بیشتر یا عملکرد بهتر نیست؛ ارزش آن به مسئله، محیط، ریسک و طراحی سیستم بستگی دارد.</w:t>
       </w:r>
     </w:p>
-    <w:bookmarkEnd w:id="69"/>
-    <w:bookmarkStart w:id="70" w:name="Xd7200d5e03f84b755b84ce993564b88e63e5e50"/>
+    <w:bookmarkEnd w:id="81"/>
+    <w:bookmarkStart w:id="82" w:name="Xd7200d5e03f84b755b84ce993564b88e63e5e50"/>
     <w:p>
       <w:pPr>
         <w:pStyle w:val="Heading2"/>
@@ -5995,8 +6082,8 @@
         <w:t xml:space="preserve">این سطوح برای آموزش و تشخیص‌اند و نباید به‌عنوان استاندارد رسمی بلوغ معرفی شوند.</w:t>
       </w:r>
     </w:p>
-    <w:bookmarkEnd w:id="70"/>
-    <w:bookmarkStart w:id="71" w:name="agentic-ai-چه-چیزی-را-تغییر-میدهد"/>
+    <w:bookmarkEnd w:id="82"/>
+    <w:bookmarkStart w:id="83" w:name="agentic-ai-چه-چیزی-را-تغییر-میدهد"/>
     <w:p>
       <w:pPr>
         <w:pStyle w:val="Heading2"/>
@@ -6093,8 +6180,8 @@
         <w:t xml:space="preserve">با این حال، در این فصل وارد طراحی فنی Agent نمی‌شویم. معماری، داده، RAG، انتخاب مدل، ارزیابی، ارکستراسیون و مدیریت چرخه عمر در فصل ۵ و کاربردهای عملیاتی Agent در فصل ۷ بررسی خواهند شد.</w:t>
       </w:r>
     </w:p>
-    <w:bookmarkEnd w:id="71"/>
-    <w:bookmarkStart w:id="72" w:name="خودمختاری-هدف-نهایی-نیست"/>
+    <w:bookmarkEnd w:id="83"/>
+    <w:bookmarkStart w:id="84" w:name="خودمختاری-هدف-نهایی-نیست"/>
     <w:p>
       <w:pPr>
         <w:pStyle w:val="Heading2"/>
@@ -6245,8 +6332,8 @@
         <w:t xml:space="preserve">است.</w:t>
       </w:r>
     </w:p>
-    <w:bookmarkEnd w:id="72"/>
-    <w:bookmarkStart w:id="74" w:name="یک-آزمون-ساده-برای-مدیر"/>
+    <w:bookmarkEnd w:id="84"/>
+    <w:bookmarkStart w:id="86" w:name="یک-آزمون-ساده-برای-مدیر"/>
     <w:p>
       <w:pPr>
         <w:pStyle w:val="Heading2"/>
@@ -6422,7 +6509,7 @@
         <w:t xml:space="preserve">اگر پاسخ به بیشتر این پرسش‌ها منفی باشد، سازمان احتمالاً هنوز در مرحله آزمایش یا AI-Assisted/AI-Enabled قرار دارد.</w:t>
       </w:r>
     </w:p>
-    <w:bookmarkStart w:id="73" w:name="جمعبندی-آموزشی"/>
+    <w:bookmarkStart w:id="85" w:name="جمعبندی-آموزشی"/>
     <w:p>
       <w:pPr>
         <w:pStyle w:val="Heading3"/>
@@ -6466,10 +6553,10 @@
         </w:pict>
       </w:r>
     </w:p>
-    <w:bookmarkEnd w:id="73"/>
-    <w:bookmarkEnd w:id="74"/>
-    <w:bookmarkEnd w:id="75"/>
-    <w:bookmarkStart w:id="86" w:name="عوامل-موفقیت-و-دلایل-شکست-تحول-دیجیتال"/>
+    <w:bookmarkEnd w:id="85"/>
+    <w:bookmarkEnd w:id="86"/>
+    <w:bookmarkEnd w:id="87"/>
+    <w:bookmarkStart w:id="98" w:name="عوامل-موفقیت-و-دلایل-شکست-تحول-دیجیتال"/>
     <w:p>
       <w:pPr>
         <w:pStyle w:val="Heading1"/>
@@ -6498,7 +6585,7 @@
         <w:t xml:space="preserve">تحول دیجیتال را نمی‌توان با یک نسخه ثابت اجرا کرد؛ اما پژوهش‌های جدید چند الگوی تکرارشونده را نشان می‌دهند. مهم‌تر از فهرست‌کردن عوامل، فهم رابطه میان آنهاست. فناوری زمانی به تحول تبدیل می‌شود که مسئله، ارزش، قابلیت، فرایند، انسان، معماری، داده و حکمرانی در یک مسیر مشترک قرار گیرند.</w:t>
       </w:r>
     </w:p>
-    <w:bookmarkStart w:id="76" w:name="مسئله-و-ارزش-پیش-از-فناوری"/>
+    <w:bookmarkStart w:id="88" w:name="مسئله-و-ارزش-پیش-از-فناوری"/>
     <w:p>
       <w:pPr>
         <w:pStyle w:val="Heading2"/>
@@ -6541,8 +6628,8 @@
         <w:t xml:space="preserve">تفاوت مهمی میان «هدف فناورانه» و «هدف سازمانی» وجود دارد. «پیاده‌سازی یک مدل زبانی» هدف فناورانه است؛ «کاهش زمان تهیه پاسخ کارشناسی بدون افت کیفیت و با کنترل مسئولیت» هدف سازمانی است. هدف دوم امکان سنجش ارزش و طراحی فرایند مناسب را فراهم می‌کند.</w:t>
       </w:r>
     </w:p>
-    <w:bookmarkEnd w:id="76"/>
-    <w:bookmarkStart w:id="77" w:name="رهبری-و-مالکیت-سازمانی"/>
+    <w:bookmarkEnd w:id="88"/>
+    <w:bookmarkStart w:id="89" w:name="رهبری-و-مالکیت-سازمانی"/>
     <w:p>
       <w:pPr>
         <w:pStyle w:val="Heading2"/>
@@ -6585,8 +6672,8 @@
         <w:t xml:space="preserve">پژوهش‌های ۲۰۲۵ بر نقش رهبری، آمادگی کاربران، فرهنگ و عامل انسانی در موفقیت تحول تأکید دارند. یک مرور نظام‌مند که ۱۸۳ مقاله را تحلیل کرده است، پیشنهاد می‌کند عامل انسانی به‌عنوان یک عامل مستقل و هم‌سطح با عوامل دیگر در طراحی و ارزیابی پروژه‌های تحول دیده شود. [5]</w:t>
       </w:r>
     </w:p>
-    <w:bookmarkEnd w:id="77"/>
-    <w:bookmarkStart w:id="78" w:name="قابلیت-بهجای-خرید-فناوری"/>
+    <w:bookmarkEnd w:id="89"/>
+    <w:bookmarkStart w:id="90" w:name="قابلیت-بهجای-خرید-فناوری"/>
     <w:p>
       <w:pPr>
         <w:pStyle w:val="Heading2"/>
@@ -6677,8 +6764,8 @@
         <w:t xml:space="preserve">این تمایز در سراسر کتاب حفظ خواهد شد. فصل ۳ قابلیت را به Capability Map تبدیل می‌کند؛ فصل ۴ آن را به معماری وصل می‌کند؛ فصل ۵ قابلیت‌های داده و AI را می‌سازد و فصل ۷ آنها را در عملیات به کار می‌گیرد.</w:t>
       </w:r>
     </w:p>
-    <w:bookmarkEnd w:id="78"/>
-    <w:bookmarkStart w:id="79" w:name="داده-معماری-و-زیرساخت"/>
+    <w:bookmarkEnd w:id="90"/>
+    <w:bookmarkStart w:id="91" w:name="داده-معماری-و-زیرساخت"/>
     <w:p>
       <w:pPr>
         <w:pStyle w:val="Heading2"/>
@@ -6721,8 +6808,8 @@
         <w:t xml:space="preserve">به همین ترتیب، ابتکارهای مستقل ممکن است در یک آزمایش کوچک موفق باشند اما هنگام مقیاس‌گذاری با مشکل هویت، یکپارچگی، داده یا وابستگی به سامانه‌های قدیمی مواجه شوند. اینجاست که معماری سازمانی از یک موضوع فنی به یک الزام تحول تبدیل می‌شود.</w:t>
       </w:r>
     </w:p>
-    <w:bookmarkEnd w:id="79"/>
-    <w:bookmarkStart w:id="80" w:name="انسان-مهارت-و-تغییر-رفتار"/>
+    <w:bookmarkEnd w:id="91"/>
+    <w:bookmarkStart w:id="92" w:name="انسان-مهارت-و-تغییر-رفتار"/>
     <w:p>
       <w:pPr>
         <w:pStyle w:val="Heading2"/>
@@ -6765,8 +6852,8 @@
         <w:t xml:space="preserve">شواهد پژوهشی ۲۰۲۵ نیز این تغییر نگاه را پشتیبانی می‌کنند و نشان می‌دهند عامل انسانی، یادگیری، فرهنگ و آمادگی کارکنان با موفقیت تحول ارتباط دارند. [5][6]</w:t>
       </w:r>
     </w:p>
-    <w:bookmarkEnd w:id="80"/>
-    <w:bookmarkStart w:id="81" w:name="حکمرانی-از-ابتدا-نه-در-انتها"/>
+    <w:bookmarkEnd w:id="92"/>
+    <w:bookmarkStart w:id="93" w:name="حکمرانی-از-ابتدا-نه-در-انتها"/>
     <w:p>
       <w:pPr>
         <w:pStyle w:val="Heading2"/>
@@ -6809,8 +6896,8 @@
         <w:t xml:space="preserve">این اصل در فصل ۹ به‌صورت کامل بررسی خواهد شد. در فصل اول فقط باید آن را به‌عنوان یک جزء ضروری سیستم تحول بشناسیم.</w:t>
       </w:r>
     </w:p>
-    <w:bookmarkEnd w:id="81"/>
-    <w:bookmarkStart w:id="82" w:name="الگوی-شکست-وقتی-اجزا-همراستا-نیستند"/>
+    <w:bookmarkEnd w:id="93"/>
+    <w:bookmarkStart w:id="94" w:name="الگوی-شکست-وقتی-اجزا-همراستا-نیستند"/>
     <w:p>
       <w:pPr>
         <w:pStyle w:val="Heading2"/>
@@ -6931,8 +7018,8 @@
         <w:t xml:space="preserve">هر حلقه باید با حلقه قبل و بعد سازگار باشد.</w:t>
       </w:r>
     </w:p>
-    <w:bookmarkEnd w:id="82"/>
-    <w:bookmarkStart w:id="83" w:name="هشت-الگوی-شکست-رایج"/>
+    <w:bookmarkEnd w:id="94"/>
+    <w:bookmarkStart w:id="95" w:name="هشت-الگوی-شکست-رایج"/>
     <w:p>
       <w:pPr>
         <w:pStyle w:val="Heading2"/>
@@ -7113,8 +7200,8 @@
         <w:t xml:space="preserve">پژوهش‌های ۲۰۲۵ نیز نشان می‌دهند فناوری محرک مهم تحول است، اما نتیجه پایدار به فرهنگ، رهبری، آمادگی کاربران و یادگیری سازمانی وابسته است. [10]</w:t>
       </w:r>
     </w:p>
-    <w:bookmarkEnd w:id="83"/>
-    <w:bookmarkStart w:id="85" w:name="آزمون-پنجسؤالی-مدیریت"/>
+    <w:bookmarkEnd w:id="95"/>
+    <w:bookmarkStart w:id="97" w:name="آزمون-پنجسؤالی-مدیریت"/>
     <w:p>
       <w:pPr>
         <w:pStyle w:val="Heading2"/>
@@ -7252,7 +7339,7 @@
         <w:t xml:space="preserve">اگر پاسخ این پرسش‌ها مبهم باشد، ورود به مرحله خرید و پیاده‌سازی فناوری معمولاً زودهنگام است.</w:t>
       </w:r>
     </w:p>
-    <w:bookmarkStart w:id="84" w:name="جمعبندی-آموزشی-1"/>
+    <w:bookmarkStart w:id="96" w:name="جمعبندی-آموزشی-1"/>
     <w:p>
       <w:pPr>
         <w:pStyle w:val="Heading3"/>
@@ -7330,10 +7417,10 @@
         </w:pict>
       </w:r>
     </w:p>
-    <w:bookmarkEnd w:id="84"/>
-    <w:bookmarkEnd w:id="85"/>
-    <w:bookmarkEnd w:id="86"/>
-    <w:bookmarkStart w:id="97" w:name="Xb6ed802f3159599688fc39c25693cc5825800ce"/>
+    <w:bookmarkEnd w:id="96"/>
+    <w:bookmarkEnd w:id="97"/>
+    <w:bookmarkEnd w:id="98"/>
+    <w:bookmarkStart w:id="109" w:name="Xb6ed802f3159599688fc39c25693cc5825800ce"/>
     <w:p>
       <w:pPr>
         <w:pStyle w:val="Heading1"/>
@@ -7396,7 +7483,7 @@
         <w:t xml:space="preserve">است و شرح داخلی یک سازمان واقعی نیست. هدف آن این است که دانشجو بتواند مفاهیم فصل را روی یک مسئله سازمانی واقعی به کار ببرد و تفاوت میان تغییر فناوری و تغییر قابلیت را ببیند.</w:t>
       </w:r>
     </w:p>
-    <w:bookmarkStart w:id="87" w:name="وضعیت-اولیه"/>
+    <w:bookmarkStart w:id="99" w:name="وضعیت-اولیه"/>
     <w:p>
       <w:pPr>
         <w:pStyle w:val="Heading2"/>
@@ -7606,8 +7693,8 @@
         <w:t xml:space="preserve">را بررسی می‌کند.</w:t>
       </w:r>
     </w:p>
-    <w:bookmarkEnd w:id="87"/>
-    <w:bookmarkStart w:id="88" w:name="مرحله-اول-digitization"/>
+    <w:bookmarkEnd w:id="99"/>
+    <w:bookmarkStart w:id="100" w:name="مرحله-اول-digitization"/>
     <w:p>
       <w:pPr>
         <w:pStyle w:val="Heading2"/>
@@ -7732,8 +7819,8 @@
         <w:t xml:space="preserve">منطق اصلی خدمت تقریباً همان است.</w:t>
       </w:r>
     </w:p>
-    <w:bookmarkEnd w:id="88"/>
-    <w:bookmarkStart w:id="89" w:name="مرحله-دوم-digitalization"/>
+    <w:bookmarkEnd w:id="100"/>
+    <w:bookmarkStart w:id="101" w:name="مرحله-دوم-digitalization"/>
     <w:p>
       <w:pPr>
         <w:pStyle w:val="Heading2"/>
@@ -7858,8 +7945,8 @@
         <w:t xml:space="preserve">سازمان هنوز ممکن است همان منطق قدیمی خدمت را فقط دیجیتالی‌تر اجرا کند.</w:t>
       </w:r>
     </w:p>
-    <w:bookmarkEnd w:id="89"/>
-    <w:bookmarkStart w:id="90" w:name="مرحله-سوم-digital-transformation"/>
+    <w:bookmarkEnd w:id="101"/>
+    <w:bookmarkStart w:id="102" w:name="مرحله-سوم-digital-transformation"/>
     <w:p>
       <w:pPr>
         <w:pStyle w:val="Heading2"/>
@@ -7966,8 +8053,8 @@
         <w:t xml:space="preserve">در این مرحله سازمان دیگر فقط سریع‌تر کار قبلی را انجام نمی‌دهد؛ بخشی از روش خلق ارزش را تغییر می‌دهد.</w:t>
       </w:r>
     </w:p>
-    <w:bookmarkEnd w:id="90"/>
-    <w:bookmarkStart w:id="91" w:name="مرحله-چهارم-ai-enabled"/>
+    <w:bookmarkEnd w:id="102"/>
+    <w:bookmarkStart w:id="103" w:name="مرحله-چهارم-ai-enabled"/>
     <w:p>
       <w:pPr>
         <w:pStyle w:val="Heading2"/>
@@ -8124,8 +8211,8 @@
         <w:t xml:space="preserve">در این مرحله AI هنوز تا حد زیادی در چارچوب فرایندهای موجود عمل می‌کند، اما کیفیت تصمیم و سرعت کار را بالا می‌برد.</w:t>
       </w:r>
     </w:p>
-    <w:bookmarkEnd w:id="91"/>
-    <w:bookmarkStart w:id="92" w:name="مرحله-پنجم-حرکت-به-سمت-ai-native"/>
+    <w:bookmarkEnd w:id="103"/>
+    <w:bookmarkStart w:id="104" w:name="مرحله-پنجم-حرکت-به-سمت-ai-native"/>
     <w:p>
       <w:pPr>
         <w:pStyle w:val="Heading2"/>
@@ -8182,8 +8269,8 @@
         <w:t xml:space="preserve">اما حتی در این مرحله، همه کارها خودکار نمی‌شوند. موارد حساس، استثنایی یا پرریسک به انسان ارجاع می‌شوند و تصمیم‌های مهم قابل ردیابی باقی می‌مانند.</w:t>
       </w:r>
     </w:p>
-    <w:bookmarkEnd w:id="92"/>
-    <w:bookmarkStart w:id="93" w:name="X14b1569adb6ff832ba53878b5b69ec111d8cc99"/>
+    <w:bookmarkEnd w:id="104"/>
+    <w:bookmarkStart w:id="105" w:name="X14b1569adb6ff832ba53878b5b69ec111d8cc99"/>
     <w:p>
       <w:pPr>
         <w:pStyle w:val="Heading2"/>
@@ -8321,8 +8408,8 @@
         <w:t xml:space="preserve">بنابراین AI معمولاً ضعف‌های بنیادی سازمان را پنهان نمی‌کند؛ در بسیاری موارد آنها را آشکارتر می‌کند.</w:t>
       </w:r>
     </w:p>
-    <w:bookmarkEnd w:id="93"/>
-    <w:bookmarkStart w:id="94" w:name="تحلیل-موردی-با-مدل-نهحلقهای"/>
+    <w:bookmarkEnd w:id="105"/>
+    <w:bookmarkStart w:id="106" w:name="تحلیل-موردی-با-مدل-نهحلقهای"/>
     <w:p>
       <w:pPr>
         <w:pStyle w:val="Heading2"/>
@@ -8786,8 +8873,8 @@
         <w:t xml:space="preserve">این جدول یکی از ابزارهای مقدماتی فصل است. در فصل ۳ به Capability Map و مدل عملیاتی، در فصل ۴ به معماری، در فصل ۵ به داده و Enterprise AI، در فصل ۷ به عملیات هوشمند، در فصل ۸ به انسان و در فصل ۹ به حکمرانی تبدیل و تفصیل داده خواهد شد.</w:t>
       </w:r>
     </w:p>
-    <w:bookmarkEnd w:id="94"/>
-    <w:bookmarkStart w:id="96" w:name="پرسشهای-تحلیلی"/>
+    <w:bookmarkEnd w:id="106"/>
+    <w:bookmarkStart w:id="108" w:name="پرسشهای-تحلیلی"/>
     <w:p>
       <w:pPr>
         <w:pStyle w:val="Heading2"/>
@@ -8916,7 +9003,7 @@
         <w:t xml:space="preserve">یک Capability Map اولیه برای این شرکت در سه قابلیت «خدمت مشتری»، «تصمیم‌گیری داده‌محور» و «اتوماسیون هوشمند» ترسیم کنید.</w:t>
       </w:r>
     </w:p>
-    <w:bookmarkStart w:id="95" w:name="نتیجه-موردی"/>
+    <w:bookmarkStart w:id="107" w:name="نتیجه-موردی"/>
     <w:p>
       <w:pPr>
         <w:pStyle w:val="Heading3"/>
@@ -8994,10 +9081,10 @@
         </w:pict>
       </w:r>
     </w:p>
-    <w:bookmarkEnd w:id="95"/>
-    <w:bookmarkEnd w:id="96"/>
-    <w:bookmarkEnd w:id="97"/>
-    <w:bookmarkStart w:id="107" w:name="جمعبندی-پرسشها-و-تمرینهای-فصل"/>
+    <w:bookmarkEnd w:id="107"/>
+    <w:bookmarkEnd w:id="108"/>
+    <w:bookmarkEnd w:id="109"/>
+    <w:bookmarkStart w:id="119" w:name="جمعبندی-پرسشها-و-تمرینهای-فصل"/>
     <w:p>
       <w:pPr>
         <w:pStyle w:val="Heading1"/>
@@ -9012,7 +9099,7 @@
         <w:t xml:space="preserve">1.9 جمع‌بندی، پرسش‌ها و تمرین‌های فصل</w:t>
       </w:r>
     </w:p>
-    <w:bookmarkStart w:id="98" w:name="جمعبندی-1"/>
+    <w:bookmarkStart w:id="110" w:name="جمعبندی-1"/>
     <w:p>
       <w:pPr>
         <w:pStyle w:val="Heading2"/>
@@ -9323,8 +9410,8 @@
         <w:t xml:space="preserve">این زنجیره در فصل‌های بعدی تخصصی‌تر می‌شود و در فصل دهم به Blueprint یکپارچه تبدیل خواهد شد.</w:t>
       </w:r>
     </w:p>
-    <w:bookmarkEnd w:id="98"/>
-    <w:bookmarkStart w:id="99" w:name="پرسشهای-مفهومی"/>
+    <w:bookmarkEnd w:id="110"/>
+    <w:bookmarkStart w:id="111" w:name="پرسشهای-مفهومی"/>
     <w:p>
       <w:pPr>
         <w:pStyle w:val="Heading2"/>
@@ -9453,8 +9540,8 @@
         <w:t xml:space="preserve">چرا Intelligent Digital Transformation در این کتاب به‌عنوان تعریف عملیاتی معرفی شده است؟</w:t>
       </w:r>
     </w:p>
-    <w:bookmarkEnd w:id="99"/>
-    <w:bookmarkStart w:id="100" w:name="پرسشهای-تحلیلی-1"/>
+    <w:bookmarkEnd w:id="111"/>
+    <w:bookmarkStart w:id="112" w:name="پرسشهای-تحلیلی-1"/>
     <w:p>
       <w:pPr>
         <w:pStyle w:val="Heading2"/>
@@ -9583,8 +9670,8 @@
         <w:t xml:space="preserve">بین سرعت تحول و سطح حکمرانی چه رابطه‌ای باید برقرار باشد؟ آیا همیشه افزایش سرعت مطلوب است؟</w:t>
       </w:r>
     </w:p>
-    <w:bookmarkEnd w:id="100"/>
-    <w:bookmarkStart w:id="101" w:name="تمرین-کاربردی-اصلی"/>
+    <w:bookmarkEnd w:id="112"/>
+    <w:bookmarkStart w:id="113" w:name="تمرین-کاربردی-اصلی"/>
     <w:p>
       <w:pPr>
         <w:pStyle w:val="Heading2"/>
@@ -9904,8 +9991,8 @@
         <w:t xml:space="preserve">ارائه کند. هدف تمرین، پیشنهاد فناوری بدون منطق تصمیم‌گیری نیست.</w:t>
       </w:r>
     </w:p>
-    <w:bookmarkEnd w:id="101"/>
-    <w:bookmarkStart w:id="102" w:name="فعالیت-کلاسی-از-فناوری-به-مسئله"/>
+    <w:bookmarkEnd w:id="113"/>
+    <w:bookmarkStart w:id="114" w:name="فعالیت-کلاسی-از-فناوری-به-مسئله"/>
     <w:p>
       <w:pPr>
         <w:pStyle w:val="Heading2"/>
@@ -10067,8 +10154,8 @@
         <w:t xml:space="preserve">چگونه ارزش ایجادشده اندازه‌گیری می‌شود؟</w:t>
       </w:r>
     </w:p>
-    <w:bookmarkEnd w:id="102"/>
-    <w:bookmarkStart w:id="103" w:name="تمرین-مطالعه-موردی-پارسخدمت"/>
+    <w:bookmarkEnd w:id="114"/>
+    <w:bookmarkStart w:id="115" w:name="تمرین-مطالعه-موردی-پارسخدمت"/>
     <w:p>
       <w:pPr>
         <w:pStyle w:val="Heading2"/>
@@ -10192,8 +10279,8 @@
         <w:t xml:space="preserve">و یک صفحه توضیح دهد که شرکت در کدام نقطه از مسیر AI-Enabled به سمت AI-Native قرار دارد.</w:t>
       </w:r>
     </w:p>
-    <w:bookmarkEnd w:id="103"/>
-    <w:bookmarkStart w:id="104" w:name="راهنمای-ارزیابی-تمرین-اصلی"/>
+    <w:bookmarkEnd w:id="115"/>
+    <w:bookmarkStart w:id="116" w:name="راهنمای-ارزیابی-تمرین-اصلی"/>
     <w:p>
       <w:pPr>
         <w:pStyle w:val="Heading2"/>
@@ -10327,8 +10414,8 @@
         <w:t xml:space="preserve">استدلال، اولویت‌بندی و سنجش ارزش: 20٪</w:t>
       </w:r>
     </w:p>
-    <w:bookmarkEnd w:id="104"/>
-    <w:bookmarkStart w:id="106" w:name="نکته-برای-مدرس"/>
+    <w:bookmarkEnd w:id="116"/>
+    <w:bookmarkStart w:id="118" w:name="نکته-برای-مدرس"/>
     <w:p>
       <w:pPr>
         <w:pStyle w:val="Heading2"/>
@@ -10357,7 +10444,7 @@
         <w:t xml:space="preserve">این فصل باید بیش از حفظ اصطلاحات، قدرت تشخیص دانشجو را افزایش دهد. دانشجو باید بتواند بین «نوآوری فناورانه»، «اتوماسیون فرایند» و «تحول سازمانی» تمایز بگذارد و درباره ادعاهای فناوری‌محور سؤال انتقادی بپرسد.</w:t>
       </w:r>
     </w:p>
-    <w:bookmarkStart w:id="105" w:name="پیام-نهایی-فصل"/>
+    <w:bookmarkStart w:id="117" w:name="پیام-نهایی-فصل"/>
     <w:p>
       <w:pPr>
         <w:pStyle w:val="Heading3"/>
@@ -10404,10 +10491,10 @@
         </w:pict>
       </w:r>
     </w:p>
-    <w:bookmarkEnd w:id="105"/>
-    <w:bookmarkEnd w:id="106"/>
-    <w:bookmarkEnd w:id="107"/>
-    <w:bookmarkStart w:id="113" w:name="منابع-فصل-اول"/>
+    <w:bookmarkEnd w:id="117"/>
+    <w:bookmarkEnd w:id="118"/>
+    <w:bookmarkEnd w:id="119"/>
+    <w:bookmarkStart w:id="125" w:name="منابع-فصل-اول"/>
     <w:p>
       <w:pPr>
         <w:pStyle w:val="Heading1"/>
@@ -10422,7 +10509,7 @@
         <w:t xml:space="preserve">منابع فصل اول</w:t>
       </w:r>
     </w:p>
-    <w:bookmarkStart w:id="108" w:name="منابع-کتابی-اصلی"/>
+    <w:bookmarkStart w:id="120" w:name="منابع-کتابی-اصلی"/>
     <w:p>
       <w:pPr>
         <w:pStyle w:val="Heading2"/>
@@ -10686,8 +10773,8 @@
         <w:t xml:space="preserve">نقش در کتاب: ستون پیاده‌سازی، کاربردهای صنعتی AI، معماری‌های cloud-edge، cyber-physical systems و Digital Twin.</w:t>
       </w:r>
     </w:p>
-    <w:bookmarkEnd w:id="108"/>
-    <w:bookmarkStart w:id="109" w:name="مقالات-علمی-جدید-۲۰۲۵-و-۲۰۲۶"/>
+    <w:bookmarkEnd w:id="120"/>
+    <w:bookmarkStart w:id="121" w:name="مقالات-علمی-جدید-۲۰۲۵-و-۲۰۲۶"/>
     <w:p>
       <w:pPr>
         <w:pStyle w:val="Heading2"/>
@@ -11054,8 +11141,8 @@
         <w:t xml:space="preserve">. SSRN Working Paper. https://doi.org/10.2139/ssrn.6905079</w:t>
       </w:r>
     </w:p>
-    <w:bookmarkEnd w:id="109"/>
-    <w:bookmarkStart w:id="110" w:name="استاندارد-و-منبع-رسمی"/>
+    <w:bookmarkEnd w:id="121"/>
+    <w:bookmarkStart w:id="122" w:name="استاندارد-و-منبع-رسمی"/>
     <w:p>
       <w:pPr>
         <w:pStyle w:val="Heading2"/>
@@ -11123,8 +11210,8 @@
         <w:t xml:space="preserve">Published January 23, 2026. https://standards.ieee.org/ieee/2023/7547/</w:t>
       </w:r>
     </w:p>
-    <w:bookmarkEnd w:id="110"/>
-    <w:bookmarkStart w:id="112" w:name="منبع-زمینهای-کلاسیک"/>
+    <w:bookmarkEnd w:id="122"/>
+    <w:bookmarkStart w:id="124" w:name="منبع-زمینهای-کلاسیک"/>
     <w:p>
       <w:pPr>
         <w:pStyle w:val="Heading2"/>
@@ -11184,7 +11271,7 @@
         <w:t xml:space="preserve">(2), 118–144. https://doi.org/10.1016/j.jsis.2019.01.003</w:t>
       </w:r>
     </w:p>
-    <w:bookmarkStart w:id="111" w:name="سیاست-استفاده-از-منابع"/>
+    <w:bookmarkStart w:id="123" w:name="سیاست-استفاده-از-منابع"/>
     <w:p>
       <w:pPr>
         <w:pStyle w:val="Heading3"/>
@@ -11227,9 +11314,9 @@
         <w:t xml:space="preserve">در فصل اول، استانداردها و چارچوب‌های حکمرانی فقط در حد معرفی و تعیین مرز مفهومی استفاده می‌شوند. شرح تفصیلی NIST AI RMF، ISO/IEC 42001 و چارچوب‌های تخصصی حکمرانی در فصل ۹ ارائه خواهد شد.</w:t>
       </w:r>
     </w:p>
-    <w:bookmarkEnd w:id="111"/>
-    <w:bookmarkEnd w:id="112"/>
-    <w:bookmarkEnd w:id="113"/>
+    <w:bookmarkEnd w:id="123"/>
+    <w:bookmarkEnd w:id="124"/>
+    <w:bookmarkEnd w:id="125"/>
     <w:sectPr>
       <w:headerReference r:id="rId9" w:type="default"/>
       <w:footerReference r:id="rId10" w:type="default"/>

</xml_diff>